<commit_message>
Vertical cannabis: deck de investidores (pptx + html) e roteiro de demo para socios
Deck de 14 slides no tema da marca, gerado em pptxgenjs e validado;
versao HTML gemea (deck.html) navegavel por teclado, exportada atras do
gate do site. Roteiro de demonstracao com checklist, timing de reuniao e
respostas honestas as perguntas de socios.

Co-Authored-By: Claude <noreply@anthropic.com>
Claude-Session: https://claude.ai/code/session_018WZd4PZy53xqMaYcFDrxLe
</commit_message>
<xml_diff>
--- a/docs/cannabis/README.docx
+++ b/docs/cannabis/README.docx
@@ -95,6 +95,30 @@
       </w:pPr>
       <w:r>
         <w:t xml:space="preserve">`SKILLS_E_FERRAMENTAS.md` — as 30 skills/MCPs mais uteis ao vertical.</w:t>
+      </w:r>
+    </w:p>
+    <w:p>
+      <w:pPr>
+        <w:pStyle w:val="ListParagraph"/>
+        <w:numPr>
+          <w:ilvl w:val="0"/>
+          <w:numId w:val="1"/>
+        </w:numPr>
+      </w:pPr>
+      <w:r>
+        <w:t xml:space="preserve">`DECK_INVESTIDORES_CINALA.pptx` — deck de investidores (14 slides, tema da marca); versao HTML gemea em `dist-cannabis/deck.html`.</w:t>
+      </w:r>
+    </w:p>
+    <w:p>
+      <w:pPr>
+        <w:pStyle w:val="ListParagraph"/>
+        <w:numPr>
+          <w:ilvl w:val="0"/>
+          <w:numId w:val="1"/>
+        </w:numPr>
+      </w:pPr>
+      <w:r>
+        <w:t xml:space="preserve">`DEMO_SOCIOS.md` — roteiro de demonstracao do site, deck e app para reunioes com socios.</w:t>
       </w:r>
     </w:p>
     <w:p>

</xml_diff>